<commit_message>
FVE: PDF export nabidky + formular Co je/neni v cene (odskrtavatelne + pridavani polozek)
</commit_message>
<xml_diff>
--- a/public/templates/nabidka_fve_sablona.docx
+++ b/public/templates/nabidka_fve_sablona.docx
@@ -2691,6 +2691,11 @@
       </w:r>
     </w:p>
     <w:p>
+      <w:r>
+        <w:t>{#zahrnuto}</w:t>
+      </w:r>
+    </w:p>
+    <w:p>
       <w:pPr>
         <w:pStyle w:val="Normal"/>
         <w:tabs>
@@ -2715,124 +2720,12 @@
           <w:rFonts w:cs="Arial" w:ascii="Arial" w:hAnsi="Arial"/>
           <w:lang w:val="la-VA"/>
         </w:rPr>
-        <w:t>Dodávka FVE a všech komponent</w:t>
-        <w:tab/>
-        <w:t>• Revize systému</w:t>
-      </w:r>
-    </w:p>
-    <w:p>
-      <w:pPr>
-        <w:pStyle w:val="Normal"/>
-        <w:tabs>
-          <w:tab w:val="clear" w:pos="709"/>
-          <w:tab w:val="left" w:pos="4625" w:leader="none"/>
-        </w:tabs>
-        <w:spacing w:lineRule="auto" w:line="276" w:before="0" w:after="0"/>
-        <w:rPr>
-          <w:rFonts w:ascii="Arial" w:hAnsi="Arial" w:cs="Arial"/>
-          <w:lang w:val="la-VA"/>
-        </w:rPr>
-      </w:pPr>
-      <w:r>
-        <w:rPr>
-          <w:rFonts w:cs="Arial" w:ascii="Arial" w:hAnsi="Arial"/>
-          <w:lang w:val="la-VA"/>
-        </w:rPr>
-        <w:t xml:space="preserve">• </w:t>
-      </w:r>
-      <w:r>
-        <w:rPr>
-          <w:rFonts w:cs="Arial" w:ascii="Arial" w:hAnsi="Arial"/>
-          <w:lang w:val="la-VA"/>
-        </w:rPr>
-        <w:t>Instalace FVE</w:t>
-      </w:r>
-    </w:p>
-    <w:p>
-      <w:pPr>
-        <w:pStyle w:val="Normal"/>
-        <w:tabs>
-          <w:tab w:val="clear" w:pos="709"/>
-          <w:tab w:val="left" w:pos="4625" w:leader="none"/>
-        </w:tabs>
-        <w:spacing w:lineRule="auto" w:line="276" w:before="0" w:after="0"/>
-        <w:rPr>
-          <w:rFonts w:ascii="Arial" w:hAnsi="Arial" w:cs="Arial"/>
-          <w:lang w:val="la-VA"/>
-        </w:rPr>
-      </w:pPr>
-      <w:r>
-        <w:rPr>
-          <w:rFonts w:cs="Arial" w:ascii="Arial" w:hAnsi="Arial"/>
-          <w:lang w:val="la-VA"/>
-        </w:rPr>
-        <w:t xml:space="preserve">• </w:t>
-      </w:r>
-      <w:r>
-        <w:rPr>
-          <w:rFonts w:cs="Arial" w:ascii="Arial" w:hAnsi="Arial"/>
-          <w:lang w:val="la-VA"/>
-        </w:rPr>
-        <w:t>Odborná montáž panelů</w:t>
-        <w:tab/>
-        <w:t>• Vyřízení připojení k distribuční síti</w:t>
-      </w:r>
-    </w:p>
-    <w:p>
-      <w:pPr>
-        <w:pStyle w:val="Normal"/>
-        <w:tabs>
-          <w:tab w:val="clear" w:pos="709"/>
-          <w:tab w:val="left" w:pos="4625" w:leader="none"/>
-        </w:tabs>
-        <w:spacing w:lineRule="auto" w:line="276" w:before="0" w:after="0"/>
-        <w:rPr>
-          <w:rFonts w:ascii="Arial" w:hAnsi="Arial" w:cs="Arial"/>
-          <w:lang w:val="la-VA"/>
-        </w:rPr>
-      </w:pPr>
-      <w:r>
-        <w:rPr>
-          <w:rFonts w:cs="Arial" w:ascii="Arial" w:hAnsi="Arial"/>
-          <w:lang w:val="la-VA"/>
-        </w:rPr>
-        <w:t xml:space="preserve">• </w:t>
-      </w:r>
-      <w:r>
-        <w:rPr>
-          <w:rFonts w:cs="Arial" w:ascii="Arial" w:hAnsi="Arial"/>
-          <w:lang w:val="la-VA"/>
-        </w:rPr>
-        <w:t>Provedení elektroinstalačních prací</w:t>
-        <w:tab/>
-        <w:t>• Konečné zprovoznění a předání FVE</w:t>
-      </w:r>
-    </w:p>
-    <w:p>
-      <w:pPr>
-        <w:pStyle w:val="Normal"/>
-        <w:tabs>
-          <w:tab w:val="clear" w:pos="709"/>
-          <w:tab w:val="left" w:pos="4625" w:leader="none"/>
-        </w:tabs>
-        <w:spacing w:lineRule="auto" w:line="276" w:before="0" w:after="0"/>
-        <w:rPr>
-          <w:rFonts w:ascii="Arial" w:hAnsi="Arial" w:cs="Arial"/>
-          <w:lang w:val="la-VA"/>
-        </w:rPr>
-      </w:pPr>
-      <w:r>
-        <w:rPr>
-          <w:rFonts w:cs="Arial" w:ascii="Arial" w:hAnsi="Arial"/>
-          <w:lang w:val="la-VA"/>
-        </w:rPr>
-        <w:t>•</w:t>
-      </w:r>
-      <w:r>
-        <w:rPr>
-          <w:rFonts w:cs="Arial" w:ascii="Arial" w:hAnsi="Arial"/>
-        </w:rPr>
-        <w:t>Back-up kompletní záloha domu s přepínačem</w:t>
+        <w:t>{.}</w:t>
+      </w:r>
+    </w:p>
+    <w:p>
+      <w:r>
+        <w:t>{/zahrnuto}</w:t>
       </w:r>
     </w:p>
     <w:p>
@@ -2971,6 +2864,11 @@
       </w:r>
     </w:p>
     <w:p>
+      <w:r>
+        <w:t>{#nezahrnuto}</w:t>
+      </w:r>
+    </w:p>
+    <w:p>
       <w:pPr>
         <w:pStyle w:val="Normal"/>
         <w:tabs>
@@ -2988,14 +2886,19 @@
           <w:rFonts w:cs="Arial" w:ascii="Arial" w:hAnsi="Arial"/>
           <w:lang w:val="la-VA"/>
         </w:rPr>
-        <w:t>•</w:t>
-      </w:r>
-      <w:r>
-        <w:rPr>
-          <w:rFonts w:cs="Arial" w:ascii="Arial" w:hAnsi="Arial"/>
-          <w:lang w:val="la-VA"/>
-        </w:rPr>
-        <w:t>Úprava odběrného místa (elektroměrový sloupek) dle požadavků distribuční společnosti</w:t>
+        <w:t xml:space="preserve">• </w:t>
+      </w:r>
+      <w:r>
+        <w:rPr>
+          <w:rFonts w:cs="Arial" w:ascii="Arial" w:hAnsi="Arial"/>
+          <w:lang w:val="la-VA"/>
+        </w:rPr>
+        <w:t>{.}</w:t>
+      </w:r>
+    </w:p>
+    <w:p>
+      <w:r>
+        <w:t>{/nezahrnuto}</w:t>
       </w:r>
     </w:p>
     <w:p>

</xml_diff>

<commit_message>
Sablona nabidky: odebrat prazdny radek mezi Za tym pracovniku a podpisem
</commit_message>
<xml_diff>
--- a/public/templates/nabidka_fve_sablona.docx
+++ b/public/templates/nabidka_fve_sablona.docx
@@ -425,24 +425,6 @@
           <w:lang w:val="la-VA"/>
         </w:rPr>
         <w:t>Za tým pracovníků společnosti</w:t>
-      </w:r>
-    </w:p>
-    <w:p>
-      <w:pPr>
-        <w:pStyle w:val="Normal"/>
-        <w:spacing w:lineRule="auto" w:line="276" w:before="0" w:after="0"/>
-        <w:rPr>
-          <w:rFonts w:ascii="Arial" w:hAnsi="Arial" w:cs="Arial"/>
-          <w:lang w:val="en-US" w:eastAsia="en-US"/>
-        </w:rPr>
-      </w:pPr>
-      <w:r>
-        <w:rPr>
-          <w:rFonts w:cs="Arial" w:ascii="Arial" w:hAnsi="Arial"/>
-          <w:sz w:val="24"/>
-          <w:szCs w:val="24"/>
-          <w:lang w:val="en-US" w:eastAsia="en-US"/>
-        </w:rPr>
       </w:r>
     </w:p>
     <w:p>

</xml_diff>